<commit_message>
Fix visualization edit main dissertation text and rewrite rmd for html and word
</commit_message>
<xml_diff>
--- a/11_word_reference.docx
+++ b/11_word_reference.docx
@@ -383,6 +383,7 @@
       </w:r>
     </w:p>
     <w:sectPr>
+      <w:footerReference w:type="default" r:id="rId9"/>
       <w:pgSz w:w="11906" w:h="16838"/>
       <w:pgMar w:top="1417" w:right="1417" w:bottom="1417" w:left="1417" w:header="708" w:footer="708" w:gutter="0"/>
     </w:sectPr>
@@ -392,6 +393,55 @@
 
 <file path=word/comments.xml><?xml version="1.0" encoding="utf-8"?>
 <w:comments xmlns:w="http://schemas.openxmlformats.org/wordprocessingml/2006/main" xmlns:m="http://schemas.openxmlformats.org/officeDocument/2006/math" xmlns:r="http://schemas.openxmlformats.org/officeDocument/2006/relationships" xmlns:o="urn:schemas-microsoft-com:office:office" xmlns:v="urn:schemas-microsoft-com:vml" xmlns:w10="urn:schemas-microsoft-com:office:word" xmlns:a="http://schemas.openxmlformats.org/drawingml/2006/main" xmlns:pic="http://schemas.openxmlformats.org/drawingml/2006/picture" xmlns:wp="http://schemas.openxmlformats.org/drawingml/2006/wordprocessingDrawing"/>
+</file>
+
+<file path=word/footer1.xml><?xml version="1.0" encoding="utf-8"?>
+<w:ftr xmlns:w="http://schemas.openxmlformats.org/wordprocessingml/2006/main">
+  <w:p>
+    <w:pPr>
+      <w:jc w:val="right"/>
+      <w:rPr>
+        <w:sz w:val="18"/>
+        <w:color w:val="767676"/>
+      </w:rPr>
+    </w:pPr>
+    <w:r>
+      <w:rPr>
+        <w:sz w:val="18"/>
+        <w:color w:val="767676"/>
+      </w:rPr>
+      <w:fldChar w:fldCharType="begin"/>
+    </w:r>
+    <w:r>
+      <w:rPr>
+        <w:sz w:val="18"/>
+        <w:color w:val="767676"/>
+      </w:rPr>
+      <w:instrText xml:space="preserve"> PAGE </w:instrText>
+    </w:r>
+    <w:r>
+      <w:rPr>
+        <w:sz w:val="18"/>
+        <w:color w:val="767676"/>
+      </w:rPr>
+      <w:fldChar w:fldCharType="separate"/>
+    </w:r>
+    <w:r>
+      <w:rPr>
+        <w:sz w:val="18"/>
+        <w:color w:val="767676"/>
+      </w:rPr>
+      <w:t>1</w:t>
+    </w:r>
+    <w:r>
+      <w:rPr>
+        <w:sz w:val="18"/>
+        <w:color w:val="767676"/>
+      </w:rPr>
+      <w:fldChar w:fldCharType="end"/>
+    </w:r>
+  </w:p>
+</w:ftr>
 </file>
 
 <file path=word/footnotes.xml><?xml version="1.0" encoding="utf-8"?>
@@ -976,6 +1026,21 @@
     <w:pPr>
       <w:keepNext/>
     </w:pPr>
+  </w:style>
+  <w:style w:type="paragraph" w:customStyle="1" w:styleId="IntroBlock">
+    <w:name w:val="Intro Block"/>
+    <w:basedOn w:val="Normal"/>
+    <w:next w:val="IntroBlock"/>
+    <w:qFormat/>
+    <w:pPr>
+      <w:spacing w:after="160"/>
+      <w:jc w:val="left"/>
+    </w:pPr>
+    <w:rPr>
+      <w:i/>
+      <w:iCs/>
+      <w:color w:val="444444"/>
+    </w:rPr>
   </w:style>
   <w:style w:type="paragraph" w:customStyle="1" w:styleId="ImageCaption">
     <w:name w:val="Image Caption"/>
@@ -1108,7 +1173,7 @@
     </a:clrScheme>
     <a:fontScheme name="Office">
       <a:majorFont>
-        <a:latin typeface="Calibri"/>
+        <a:latin typeface="Times New Roman"/>
         <a:ea typeface=""/>
         <a:cs typeface=""/>
         <a:font script="Jpan" typeface="ＭＳ ゴシック"/>
@@ -1142,7 +1207,7 @@
         <a:font script="Uigh" typeface="Microsoft Uighur"/>
       </a:majorFont>
       <a:minorFont>
-        <a:latin typeface="Cambria"/>
+        <a:latin typeface="Times New Roman"/>
         <a:ea typeface=""/>
         <a:cs typeface=""/>
         <a:font script="Jpan" typeface="ＭＳ 明朝"/>

</xml_diff>